<commit_message>
fix architecture diagrams and add requirements traceability
- Replace ASCII art with Mermaid diagrams in README and FSD doc
- Add requirements traceability table to FSD (R1-NF5-D4)
- Replace Production Deploy Checklist with System Design Overview
- Re-export architecture-fsd.docx

Co-Authored-By: Claude Sonnet 4.6 <noreply@anthropic.com>
</commit_message>
<xml_diff>
--- a/docs/architecture-fsd.docx
+++ b/docs/architecture-fsd.docx
@@ -28,7 +28,7 @@
         </w:p>
       </w:sdtContent>
     </w:sdt>
-    <w:bookmarkStart w:id="94" w:name="Xf4e669289ac9b214d005edafc5bbcef32cb68fb"/>
+    <w:bookmarkStart w:id="95" w:name="Xf4e669289ac9b214d005edafc5bbcef32cb68fb"/>
     <w:p>
       <w:pPr>
         <w:pStyle w:val="Heading1"/>
@@ -110,7 +110,894 @@
         </w:pict>
       </w:r>
     </w:p>
-    <w:bookmarkStart w:id="9" w:name="table-of-contents"/>
+    <w:bookmarkStart w:id="9" w:name="requirements-traceability"/>
+    <w:p>
+      <w:pPr>
+        <w:pStyle w:val="Heading2"/>
+      </w:pPr>
+      <w:r>
+        <w:t xml:space="preserve">Requirements Traceability</w:t>
+      </w:r>
+    </w:p>
+    <w:tbl>
+      <w:tblPr>
+        <w:tblStyle w:val="Table"/>
+        <w:tblW w:type="pct" w:w="5000"/>
+        <w:tblLayout w:type="fixed"/>
+        <w:tblLook w:firstRow="1" w:lastRow="0" w:firstColumn="0" w:lastColumn="0" w:noHBand="0" w:noVBand="0" w:val="0020"/>
+      </w:tblPr>
+      <w:tblGrid>
+        <w:gridCol w:w="1980"/>
+        <w:gridCol w:w="1980"/>
+        <w:gridCol w:w="1980"/>
+        <w:gridCol w:w="1980"/>
+      </w:tblGrid>
+      <w:tr>
+        <w:trPr>
+          <w:tblHeader w:val="on"/>
+        </w:trPr>
+        <w:tc>
+          <w:tcPr/>
+          <w:p>
+            <w:pPr>
+              <w:pStyle w:val="Compact"/>
+            </w:pPr>
+            <w:r>
+              <w:t xml:space="preserve">#</w:t>
+            </w:r>
+          </w:p>
+        </w:tc>
+        <w:tc>
+          <w:tcPr/>
+          <w:p>
+            <w:pPr>
+              <w:pStyle w:val="Compact"/>
+            </w:pPr>
+            <w:r>
+              <w:t xml:space="preserve">Requirement</w:t>
+            </w:r>
+          </w:p>
+        </w:tc>
+        <w:tc>
+          <w:tcPr/>
+          <w:p>
+            <w:pPr>
+              <w:pStyle w:val="Compact"/>
+            </w:pPr>
+            <w:r>
+              <w:t xml:space="preserve">Status</w:t>
+            </w:r>
+          </w:p>
+        </w:tc>
+        <w:tc>
+          <w:tcPr/>
+          <w:p>
+            <w:pPr>
+              <w:pStyle w:val="Compact"/>
+            </w:pPr>
+            <w:r>
+              <w:t xml:space="preserve">Implementation</w:t>
+            </w:r>
+          </w:p>
+        </w:tc>
+      </w:tr>
+      <w:tr>
+        <w:tc>
+          <w:tcPr/>
+          <w:p>
+            <w:pPr>
+              <w:pStyle w:val="Compact"/>
+            </w:pPr>
+            <w:r>
+              <w:t xml:space="preserve">R1</w:t>
+            </w:r>
+          </w:p>
+        </w:tc>
+        <w:tc>
+          <w:tcPr/>
+          <w:p>
+            <w:pPr>
+              <w:pStyle w:val="Compact"/>
+            </w:pPr>
+            <w:r>
+              <w:t xml:space="preserve">Authentication with user registration and login</w:t>
+            </w:r>
+          </w:p>
+        </w:tc>
+        <w:tc>
+          <w:tcPr/>
+          <w:p>
+            <w:pPr>
+              <w:pStyle w:val="Compact"/>
+            </w:pPr>
+            <w:r>
+              <w:t xml:space="preserve">✅</w:t>
+            </w:r>
+          </w:p>
+        </w:tc>
+        <w:tc>
+          <w:tcPr/>
+          <w:p>
+            <w:pPr>
+              <w:pStyle w:val="Compact"/>
+            </w:pPr>
+            <w:r>
+              <w:t xml:space="preserve">Better Auth v1.6.14 — email + bcrypt password, HTTP-only session cookie</w:t>
+            </w:r>
+          </w:p>
+        </w:tc>
+      </w:tr>
+      <w:tr>
+        <w:tc>
+          <w:tcPr/>
+          <w:p>
+            <w:pPr>
+              <w:pStyle w:val="Compact"/>
+            </w:pPr>
+            <w:r>
+              <w:t xml:space="preserve">R2</w:t>
+            </w:r>
+          </w:p>
+        </w:tc>
+        <w:tc>
+          <w:tcPr/>
+          <w:p>
+            <w:pPr>
+              <w:pStyle w:val="Compact"/>
+            </w:pPr>
+            <w:r>
+              <w:t xml:space="preserve">Allow creation of user accounts</w:t>
+            </w:r>
+          </w:p>
+        </w:tc>
+        <w:tc>
+          <w:tcPr/>
+          <w:p>
+            <w:pPr>
+              <w:pStyle w:val="Compact"/>
+            </w:pPr>
+            <w:r>
+              <w:t xml:space="preserve">✅</w:t>
+            </w:r>
+          </w:p>
+        </w:tc>
+        <w:tc>
+          <w:tcPr/>
+          <w:p>
+            <w:pPr>
+              <w:pStyle w:val="Compact"/>
+            </w:pPr>
+            <w:r>
+              <w:rPr>
+                <w:rStyle w:val="VerbatimChar"/>
+              </w:rPr>
+              <w:t xml:space="preserve">POST /api/auth/sign-up</w:t>
+            </w:r>
+            <w:r>
+              <w:t xml:space="preserve"> </w:t>
+            </w:r>
+            <w:r>
+              <w:t xml:space="preserve">→ User record + OTP email via Resend</w:t>
+            </w:r>
+          </w:p>
+        </w:tc>
+      </w:tr>
+      <w:tr>
+        <w:tc>
+          <w:tcPr/>
+          <w:p>
+            <w:pPr>
+              <w:pStyle w:val="Compact"/>
+            </w:pPr>
+            <w:r>
+              <w:t xml:space="preserve">R3</w:t>
+            </w:r>
+          </w:p>
+        </w:tc>
+        <w:tc>
+          <w:tcPr/>
+          <w:p>
+            <w:pPr>
+              <w:pStyle w:val="Compact"/>
+            </w:pPr>
+            <w:r>
+              <w:t xml:space="preserve">Login using email and password</w:t>
+            </w:r>
+          </w:p>
+        </w:tc>
+        <w:tc>
+          <w:tcPr/>
+          <w:p>
+            <w:pPr>
+              <w:pStyle w:val="Compact"/>
+            </w:pPr>
+            <w:r>
+              <w:t xml:space="preserve">✅</w:t>
+            </w:r>
+          </w:p>
+        </w:tc>
+        <w:tc>
+          <w:tcPr/>
+          <w:p>
+            <w:pPr>
+              <w:pStyle w:val="Compact"/>
+            </w:pPr>
+            <w:r>
+              <w:rPr>
+                <w:rStyle w:val="VerbatimChar"/>
+              </w:rPr>
+              <w:t xml:space="preserve">POST /api/auth/sign-in/email</w:t>
+            </w:r>
+            <w:r>
+              <w:t xml:space="preserve"> </w:t>
+            </w:r>
+            <w:r>
+              <w:t xml:space="preserve">→ session created, cookie set</w:t>
+            </w:r>
+          </w:p>
+        </w:tc>
+      </w:tr>
+      <w:tr>
+        <w:tc>
+          <w:tcPr/>
+          <w:p>
+            <w:pPr>
+              <w:pStyle w:val="Compact"/>
+            </w:pPr>
+            <w:r>
+              <w:t xml:space="preserve">R4</w:t>
+            </w:r>
+          </w:p>
+        </w:tc>
+        <w:tc>
+          <w:tcPr/>
+          <w:p>
+            <w:pPr>
+              <w:pStyle w:val="Compact"/>
+            </w:pPr>
+            <w:r>
+              <w:t xml:space="preserve">Store and associate prompts with a project/agent</w:t>
+            </w:r>
+          </w:p>
+        </w:tc>
+        <w:tc>
+          <w:tcPr/>
+          <w:p>
+            <w:pPr>
+              <w:pStyle w:val="Compact"/>
+            </w:pPr>
+            <w:r>
+              <w:t xml:space="preserve">✅</w:t>
+            </w:r>
+          </w:p>
+        </w:tc>
+        <w:tc>
+          <w:tcPr/>
+          <w:p>
+            <w:pPr>
+              <w:pStyle w:val="Compact"/>
+            </w:pPr>
+            <w:r>
+              <w:rPr>
+                <w:rStyle w:val="VerbatimChar"/>
+              </w:rPr>
+              <w:t xml:space="preserve">SavedPrompt</w:t>
+            </w:r>
+            <w:r>
+              <w:t xml:space="preserve"> </w:t>
+            </w:r>
+            <w:r>
+              <w:t xml:space="preserve">table (FK → Agent + User), CRUD at</w:t>
+            </w:r>
+            <w:r>
+              <w:t xml:space="preserve"> </w:t>
+            </w:r>
+            <w:r>
+              <w:rPr>
+                <w:rStyle w:val="VerbatimChar"/>
+              </w:rPr>
+              <w:t xml:space="preserve">/api/saved-prompts</w:t>
+            </w:r>
+          </w:p>
+        </w:tc>
+      </w:tr>
+      <w:tr>
+        <w:tc>
+          <w:tcPr/>
+          <w:p>
+            <w:pPr>
+              <w:pStyle w:val="Compact"/>
+            </w:pPr>
+            <w:r>
+              <w:t xml:space="preserve">R5</w:t>
+            </w:r>
+          </w:p>
+        </w:tc>
+        <w:tc>
+          <w:tcPr/>
+          <w:p>
+            <w:pPr>
+              <w:pStyle w:val="Compact"/>
+            </w:pPr>
+            <w:r>
+              <w:t xml:space="preserve">Chat interface via OpenAI Responses API</w:t>
+            </w:r>
+          </w:p>
+        </w:tc>
+        <w:tc>
+          <w:tcPr/>
+          <w:p>
+            <w:pPr>
+              <w:pStyle w:val="Compact"/>
+            </w:pPr>
+            <w:r>
+              <w:t xml:space="preserve">✅</w:t>
+            </w:r>
+          </w:p>
+        </w:tc>
+        <w:tc>
+          <w:tcPr/>
+          <w:p>
+            <w:pPr>
+              <w:pStyle w:val="Compact"/>
+            </w:pPr>
+            <w:r>
+              <w:rPr>
+                <w:rStyle w:val="VerbatimChar"/>
+              </w:rPr>
+              <w:t xml:space="preserve">POST /api/chat</w:t>
+            </w:r>
+            <w:r>
+              <w:t xml:space="preserve"> </w:t>
+            </w:r>
+            <w:r>
+              <w:t xml:space="preserve">— SSE stream using</w:t>
+            </w:r>
+            <w:r>
+              <w:t xml:space="preserve"> </w:t>
+            </w:r>
+            <w:r>
+              <w:rPr>
+                <w:rStyle w:val="VerbatimChar"/>
+              </w:rPr>
+              <w:t xml:space="preserve">openai.responses.create()</w:t>
+            </w:r>
+          </w:p>
+        </w:tc>
+      </w:tr>
+      <w:tr>
+        <w:tc>
+          <w:tcPr/>
+          <w:p>
+            <w:pPr>
+              <w:pStyle w:val="Compact"/>
+            </w:pPr>
+            <w:r>
+              <w:t xml:space="preserve">R6</w:t>
+            </w:r>
+          </w:p>
+        </w:tc>
+        <w:tc>
+          <w:tcPr/>
+          <w:p>
+            <w:pPr>
+              <w:pStyle w:val="Compact"/>
+            </w:pPr>
+            <w:r>
+              <w:t xml:space="preserve">Upload files to a project (OpenAI Files API)</w:t>
+            </w:r>
+          </w:p>
+        </w:tc>
+        <w:tc>
+          <w:tcPr/>
+          <w:p>
+            <w:pPr>
+              <w:pStyle w:val="Compact"/>
+            </w:pPr>
+            <w:r>
+              <w:t xml:space="preserve">✅</w:t>
+            </w:r>
+          </w:p>
+        </w:tc>
+        <w:tc>
+          <w:tcPr/>
+          <w:p>
+            <w:pPr>
+              <w:pStyle w:val="Compact"/>
+            </w:pPr>
+            <w:r>
+              <w:rPr>
+                <w:rStyle w:val="VerbatimChar"/>
+              </w:rPr>
+              <w:t xml:space="preserve">POST /api/agents/[id]/files</w:t>
+            </w:r>
+            <w:r>
+              <w:t xml:space="preserve"> </w:t>
+            </w:r>
+            <w:r>
+              <w:t xml:space="preserve">→ OpenAI Files API + vector store indexing</w:t>
+            </w:r>
+          </w:p>
+        </w:tc>
+      </w:tr>
+      <w:tr>
+        <w:tc>
+          <w:tcPr/>
+          <w:p>
+            <w:pPr>
+              <w:pStyle w:val="Compact"/>
+            </w:pPr>
+            <w:r>
+              <w:t xml:space="preserve">NF1</w:t>
+            </w:r>
+          </w:p>
+        </w:tc>
+        <w:tc>
+          <w:tcPr/>
+          <w:p>
+            <w:pPr>
+              <w:pStyle w:val="Compact"/>
+            </w:pPr>
+            <w:r>
+              <w:t xml:space="preserve">Scalability — multiple users and projects</w:t>
+            </w:r>
+          </w:p>
+        </w:tc>
+        <w:tc>
+          <w:tcPr/>
+          <w:p>
+            <w:pPr>
+              <w:pStyle w:val="Compact"/>
+            </w:pPr>
+            <w:r>
+              <w:t xml:space="preserve">✅</w:t>
+            </w:r>
+          </w:p>
+        </w:tc>
+        <w:tc>
+          <w:tcPr/>
+          <w:p>
+            <w:pPr>
+              <w:pStyle w:val="Compact"/>
+            </w:pPr>
+            <w:r>
+              <w:t xml:space="preserve">DB indexed by userId/agentId; stateless Next.js; rate limiting per user</w:t>
+            </w:r>
+          </w:p>
+        </w:tc>
+      </w:tr>
+      <w:tr>
+        <w:tc>
+          <w:tcPr/>
+          <w:p>
+            <w:pPr>
+              <w:pStyle w:val="Compact"/>
+            </w:pPr>
+            <w:r>
+              <w:t xml:space="preserve">NF2</w:t>
+            </w:r>
+          </w:p>
+        </w:tc>
+        <w:tc>
+          <w:tcPr/>
+          <w:p>
+            <w:pPr>
+              <w:pStyle w:val="Compact"/>
+            </w:pPr>
+            <w:r>
+              <w:t xml:space="preserve">Security — protect user data and auth flows</w:t>
+            </w:r>
+          </w:p>
+        </w:tc>
+        <w:tc>
+          <w:tcPr/>
+          <w:p>
+            <w:pPr>
+              <w:pStyle w:val="Compact"/>
+            </w:pPr>
+            <w:r>
+              <w:t xml:space="preserve">✅</w:t>
+            </w:r>
+          </w:p>
+        </w:tc>
+        <w:tc>
+          <w:tcPr/>
+          <w:p>
+            <w:pPr>
+              <w:pStyle w:val="Compact"/>
+            </w:pPr>
+            <w:r>
+              <w:t xml:space="preserve">Session-gated routes, ownership checks, Cloudflare Turnstile, HTTP-only cookies</w:t>
+            </w:r>
+          </w:p>
+        </w:tc>
+      </w:tr>
+      <w:tr>
+        <w:tc>
+          <w:tcPr/>
+          <w:p>
+            <w:pPr>
+              <w:pStyle w:val="Compact"/>
+            </w:pPr>
+            <w:r>
+              <w:t xml:space="preserve">NF3</w:t>
+            </w:r>
+          </w:p>
+        </w:tc>
+        <w:tc>
+          <w:tcPr/>
+          <w:p>
+            <w:pPr>
+              <w:pStyle w:val="Compact"/>
+            </w:pPr>
+            <w:r>
+              <w:t xml:space="preserve">Extensibility — allow future additions</w:t>
+            </w:r>
+          </w:p>
+        </w:tc>
+        <w:tc>
+          <w:tcPr/>
+          <w:p>
+            <w:pPr>
+              <w:pStyle w:val="Compact"/>
+            </w:pPr>
+            <w:r>
+              <w:t xml:space="preserve">✅</w:t>
+            </w:r>
+          </w:p>
+        </w:tc>
+        <w:tc>
+          <w:tcPr/>
+          <w:p>
+            <w:pPr>
+              <w:pStyle w:val="Compact"/>
+            </w:pPr>
+            <w:r>
+              <w:t xml:space="preserve">Models decoupled in</w:t>
+            </w:r>
+            <w:r>
+              <w:t xml:space="preserve"> </w:t>
+            </w:r>
+            <w:r>
+              <w:rPr>
+                <w:rStyle w:val="VerbatimChar"/>
+              </w:rPr>
+              <w:t xml:space="preserve">lib/agents/models.ts</w:t>
+            </w:r>
+            <w:r>
+              <w:t xml:space="preserve">; tools additive array; plugin-ready auth</w:t>
+            </w:r>
+          </w:p>
+        </w:tc>
+      </w:tr>
+      <w:tr>
+        <w:tc>
+          <w:tcPr/>
+          <w:p>
+            <w:pPr>
+              <w:pStyle w:val="Compact"/>
+            </w:pPr>
+            <w:r>
+              <w:t xml:space="preserve">NF4</w:t>
+            </w:r>
+          </w:p>
+        </w:tc>
+        <w:tc>
+          <w:tcPr/>
+          <w:p>
+            <w:pPr>
+              <w:pStyle w:val="Compact"/>
+            </w:pPr>
+            <w:r>
+              <w:t xml:space="preserve">Performance — low-latency chat responses</w:t>
+            </w:r>
+          </w:p>
+        </w:tc>
+        <w:tc>
+          <w:tcPr/>
+          <w:p>
+            <w:pPr>
+              <w:pStyle w:val="Compact"/>
+            </w:pPr>
+            <w:r>
+              <w:t xml:space="preserve">✅</w:t>
+            </w:r>
+          </w:p>
+        </w:tc>
+        <w:tc>
+          <w:tcPr/>
+          <w:p>
+            <w:pPr>
+              <w:pStyle w:val="Compact"/>
+            </w:pPr>
+            <w:r>
+              <w:t xml:space="preserve">SSE streaming (&lt;1s first token);</w:t>
+            </w:r>
+            <w:r>
+              <w:t xml:space="preserve"> </w:t>
+            </w:r>
+            <w:r>
+              <w:rPr>
+                <w:rStyle w:val="VerbatimChar"/>
+              </w:rPr>
+              <w:t xml:space="preserve">previous_response_id</w:t>
+            </w:r>
+            <w:r>
+              <w:t xml:space="preserve"> </w:t>
+            </w:r>
+            <w:r>
+              <w:t xml:space="preserve">avoids full history resend</w:t>
+            </w:r>
+          </w:p>
+        </w:tc>
+      </w:tr>
+      <w:tr>
+        <w:tc>
+          <w:tcPr/>
+          <w:p>
+            <w:pPr>
+              <w:pStyle w:val="Compact"/>
+            </w:pPr>
+            <w:r>
+              <w:t xml:space="preserve">NF5</w:t>
+            </w:r>
+          </w:p>
+        </w:tc>
+        <w:tc>
+          <w:tcPr/>
+          <w:p>
+            <w:pPr>
+              <w:pStyle w:val="Compact"/>
+            </w:pPr>
+            <w:r>
+              <w:t xml:space="preserve">Reliability — handle errors gracefully</w:t>
+            </w:r>
+          </w:p>
+        </w:tc>
+        <w:tc>
+          <w:tcPr/>
+          <w:p>
+            <w:pPr>
+              <w:pStyle w:val="Compact"/>
+            </w:pPr>
+            <w:r>
+              <w:t xml:space="preserve">✅</w:t>
+            </w:r>
+          </w:p>
+        </w:tc>
+        <w:tc>
+          <w:tcPr/>
+          <w:p>
+            <w:pPr>
+              <w:pStyle w:val="Compact"/>
+            </w:pPr>
+            <w:r>
+              <w:t xml:space="preserve">Error boundaries per route (</w:t>
+            </w:r>
+            <w:r>
+              <w:rPr>
+                <w:rStyle w:val="VerbatimChar"/>
+              </w:rPr>
+              <w:t xml:space="preserve">error.tsx</w:t>
+            </w:r>
+            <w:r>
+              <w:t xml:space="preserve">), SSE error events, toast notifications</w:t>
+            </w:r>
+          </w:p>
+        </w:tc>
+      </w:tr>
+      <w:tr>
+        <w:tc>
+          <w:tcPr/>
+          <w:p>
+            <w:pPr>
+              <w:pStyle w:val="Compact"/>
+            </w:pPr>
+            <w:r>
+              <w:t xml:space="preserve">D1</w:t>
+            </w:r>
+          </w:p>
+        </w:tc>
+        <w:tc>
+          <w:tcPr/>
+          <w:p>
+            <w:pPr>
+              <w:pStyle w:val="Compact"/>
+            </w:pPr>
+            <w:r>
+              <w:t xml:space="preserve">Source code in repository</w:t>
+            </w:r>
+          </w:p>
+        </w:tc>
+        <w:tc>
+          <w:tcPr/>
+          <w:p>
+            <w:pPr>
+              <w:pStyle w:val="Compact"/>
+            </w:pPr>
+            <w:r>
+              <w:t xml:space="preserve">✅</w:t>
+            </w:r>
+          </w:p>
+        </w:tc>
+        <w:tc>
+          <w:tcPr/>
+          <w:p>
+            <w:pPr>
+              <w:pStyle w:val="Compact"/>
+            </w:pPr>
+            <w:r>
+              <w:t xml:space="preserve">GitHub:</w:t>
+            </w:r>
+            <w:r>
+              <w:t xml:space="preserve"> </w:t>
+            </w:r>
+            <w:r>
+              <w:rPr>
+                <w:rStyle w:val="VerbatimChar"/>
+              </w:rPr>
+              <w:t xml:space="preserve">ridoNev1/cranberry-juice</w:t>
+            </w:r>
+          </w:p>
+        </w:tc>
+      </w:tr>
+      <w:tr>
+        <w:tc>
+          <w:tcPr/>
+          <w:p>
+            <w:pPr>
+              <w:pStyle w:val="Compact"/>
+            </w:pPr>
+            <w:r>
+              <w:t xml:space="preserve">D2</w:t>
+            </w:r>
+          </w:p>
+        </w:tc>
+        <w:tc>
+          <w:tcPr/>
+          <w:p>
+            <w:pPr>
+              <w:pStyle w:val="Compact"/>
+            </w:pPr>
+            <w:r>
+              <w:t xml:space="preserve">Instructions to run the application</w:t>
+            </w:r>
+          </w:p>
+        </w:tc>
+        <w:tc>
+          <w:tcPr/>
+          <w:p>
+            <w:pPr>
+              <w:pStyle w:val="Compact"/>
+            </w:pPr>
+            <w:r>
+              <w:t xml:space="preserve">✅</w:t>
+            </w:r>
+          </w:p>
+        </w:tc>
+        <w:tc>
+          <w:tcPr/>
+          <w:p>
+            <w:pPr>
+              <w:pStyle w:val="Compact"/>
+            </w:pPr>
+            <w:r>
+              <w:t xml:space="preserve">README.md with local setup, env vars, commands</w:t>
+            </w:r>
+          </w:p>
+        </w:tc>
+      </w:tr>
+      <w:tr>
+        <w:tc>
+          <w:tcPr/>
+          <w:p>
+            <w:pPr>
+              <w:pStyle w:val="Compact"/>
+            </w:pPr>
+            <w:r>
+              <w:t xml:space="preserve">D3</w:t>
+            </w:r>
+          </w:p>
+        </w:tc>
+        <w:tc>
+          <w:tcPr/>
+          <w:p>
+            <w:pPr>
+              <w:pStyle w:val="Compact"/>
+            </w:pPr>
+            <w:r>
+              <w:t xml:space="preserve">Brief architecture design explanation</w:t>
+            </w:r>
+          </w:p>
+        </w:tc>
+        <w:tc>
+          <w:tcPr/>
+          <w:p>
+            <w:pPr>
+              <w:pStyle w:val="Compact"/>
+            </w:pPr>
+            <w:r>
+              <w:t xml:space="preserve">✅</w:t>
+            </w:r>
+          </w:p>
+        </w:tc>
+        <w:tc>
+          <w:tcPr/>
+          <w:p>
+            <w:pPr>
+              <w:pStyle w:val="Compact"/>
+            </w:pPr>
+            <w:r>
+              <w:t xml:space="preserve">This document (</w:t>
+            </w:r>
+            <w:r>
+              <w:rPr>
+                <w:rStyle w:val="VerbatimChar"/>
+              </w:rPr>
+              <w:t xml:space="preserve">docs/architecture-fsd.docx</w:t>
+            </w:r>
+            <w:r>
+              <w:t xml:space="preserve">)</w:t>
+            </w:r>
+          </w:p>
+        </w:tc>
+      </w:tr>
+      <w:tr>
+        <w:tc>
+          <w:tcPr/>
+          <w:p>
+            <w:pPr>
+              <w:pStyle w:val="Compact"/>
+            </w:pPr>
+            <w:r>
+              <w:t xml:space="preserve">D4</w:t>
+            </w:r>
+          </w:p>
+        </w:tc>
+        <w:tc>
+          <w:tcPr/>
+          <w:p>
+            <w:pPr>
+              <w:pStyle w:val="Compact"/>
+            </w:pPr>
+            <w:r>
+              <w:t xml:space="preserve">Publicly hosted working demo</w:t>
+            </w:r>
+          </w:p>
+        </w:tc>
+        <w:tc>
+          <w:tcPr/>
+          <w:p>
+            <w:pPr>
+              <w:pStyle w:val="Compact"/>
+            </w:pPr>
+            <w:r>
+              <w:t xml:space="preserve">✅</w:t>
+            </w:r>
+          </w:p>
+        </w:tc>
+        <w:tc>
+          <w:tcPr/>
+          <w:p>
+            <w:pPr>
+              <w:pStyle w:val="Compact"/>
+            </w:pPr>
+            <w:r>
+              <w:t xml:space="preserve">https://cranberry.satu-meja.com</w:t>
+            </w:r>
+          </w:p>
+        </w:tc>
+      </w:tr>
+    </w:tbl>
+    <w:p>
+      <w:r>
+        <w:pict>
+          <v:rect style="width:0;height:1.5pt" o:hralign="center" o:hrstd="t" o:hr="t"/>
+        </w:pict>
+      </w:r>
+    </w:p>
+    <w:bookmarkEnd w:id="9"/>
+    <w:bookmarkStart w:id="10" w:name="table-of-contents"/>
     <w:p>
       <w:pPr>
         <w:pStyle w:val="Heading2"/>
@@ -347,8 +1234,8 @@
         </w:pict>
       </w:r>
     </w:p>
-    <w:bookmarkEnd w:id="9"/>
-    <w:bookmarkStart w:id="10" w:name="overview"/>
+    <w:bookmarkEnd w:id="10"/>
+    <w:bookmarkStart w:id="11" w:name="overview"/>
     <w:p>
       <w:pPr>
         <w:pStyle w:val="Heading2"/>
@@ -474,8 +1361,8 @@
         </w:pict>
       </w:r>
     </w:p>
-    <w:bookmarkEnd w:id="10"/>
-    <w:bookmarkStart w:id="16" w:name="tech-stack"/>
+    <w:bookmarkEnd w:id="11"/>
+    <w:bookmarkStart w:id="17" w:name="tech-stack"/>
     <w:p>
       <w:pPr>
         <w:pStyle w:val="Heading2"/>
@@ -484,7 +1371,7 @@
         <w:t xml:space="preserve">2. Tech Stack</w:t>
       </w:r>
     </w:p>
-    <w:bookmarkStart w:id="11" w:name="core"/>
+    <w:bookmarkStart w:id="12" w:name="core"/>
     <w:p>
       <w:pPr>
         <w:pStyle w:val="Heading3"/>
@@ -718,8 +1605,8 @@
         </w:tc>
       </w:tr>
     </w:tbl>
-    <w:bookmarkEnd w:id="11"/>
-    <w:bookmarkStart w:id="12" w:name="ui-styling"/>
+    <w:bookmarkEnd w:id="12"/>
+    <w:bookmarkStart w:id="13" w:name="ui-styling"/>
     <w:p>
       <w:pPr>
         <w:pStyle w:val="Heading3"/>
@@ -1023,8 +1910,8 @@
         </w:tc>
       </w:tr>
     </w:tbl>
-    <w:bookmarkEnd w:id="12"/>
-    <w:bookmarkStart w:id="13" w:name="data-backend"/>
+    <w:bookmarkEnd w:id="13"/>
+    <w:bookmarkStart w:id="14" w:name="data-backend"/>
     <w:p>
       <w:pPr>
         <w:pStyle w:val="Heading3"/>
@@ -1398,8 +2285,8 @@
         </w:tc>
       </w:tr>
     </w:tbl>
-    <w:bookmarkEnd w:id="13"/>
-    <w:bookmarkStart w:id="14" w:name="bot-protection"/>
+    <w:bookmarkEnd w:id="14"/>
+    <w:bookmarkStart w:id="15" w:name="bot-protection"/>
     <w:p>
       <w:pPr>
         <w:pStyle w:val="Heading3"/>
@@ -1470,8 +2357,8 @@
         </w:tc>
       </w:tr>
     </w:tbl>
-    <w:bookmarkEnd w:id="14"/>
-    <w:bookmarkStart w:id="15" w:name="dev-tools"/>
+    <w:bookmarkEnd w:id="15"/>
+    <w:bookmarkStart w:id="16" w:name="dev-tools"/>
     <w:p>
       <w:pPr>
         <w:pStyle w:val="Heading3"/>
@@ -1597,9 +2484,9 @@
         </w:pict>
       </w:r>
     </w:p>
-    <w:bookmarkEnd w:id="15"/>
     <w:bookmarkEnd w:id="16"/>
-    <w:bookmarkStart w:id="17" w:name="system-architecture"/>
+    <w:bookmarkEnd w:id="17"/>
+    <w:bookmarkStart w:id="18" w:name="system-architecture"/>
     <w:p>
       <w:pPr>
         <w:pStyle w:val="Heading2"/>
@@ -1616,7 +2503,7 @@
         <w:rPr>
           <w:rStyle w:val="VerbatimChar"/>
         </w:rPr>
-        <w:t xml:space="preserve">                          ┌──────────────────────────────────┐</w:t>
+        <w:t xml:space="preserve">flowchart TD</w:t>
       </w:r>
       <w:r>
         <w:br/>
@@ -1625,7 +2512,7 @@
         <w:rPr>
           <w:rStyle w:val="VerbatimChar"/>
         </w:rPr>
-        <w:t xml:space="preserve">                          │        User Browser               │</w:t>
+        <w:t xml:space="preserve">    Browser["User Browser\nReact 19 + Next.js App Router"]</w:t>
       </w:r>
       <w:r>
         <w:br/>
@@ -1634,7 +2521,7 @@
         <w:rPr>
           <w:rStyle w:val="VerbatimChar"/>
         </w:rPr>
-        <w:t xml:space="preserve">                          │  React 19 + Next.js App Router   │</w:t>
+        <w:t xml:space="preserve">    nginx["nginx\nSSL termination — Let's Encrypt\ncranberry.satu-meja.com"]</w:t>
       </w:r>
       <w:r>
         <w:br/>
@@ -1643,7 +2530,7 @@
         <w:rPr>
           <w:rStyle w:val="VerbatimChar"/>
         </w:rPr>
-        <w:t xml:space="preserve">                          └──────────────┬───────────────────┘</w:t>
+        <w:t xml:space="preserve">    App["Next.js App — Docker :3000\nServer Components · API Routes · SSE Streaming"]</w:t>
       </w:r>
       <w:r>
         <w:br/>
@@ -1652,7 +2539,7 @@
         <w:rPr>
           <w:rStyle w:val="VerbatimChar"/>
         </w:rPr>
-        <w:t xml:space="preserve">                                         │ HTTPS</w:t>
+        <w:t xml:space="preserve">    PG["PostgreSQL 16\nPrisma ORM\nUsers · Agents · Conversations"]</w:t>
       </w:r>
       <w:r>
         <w:br/>
@@ -1661,7 +2548,7 @@
         <w:rPr>
           <w:rStyle w:val="VerbatimChar"/>
         </w:rPr>
-        <w:t xml:space="preserve">                          ┌──────────────▼───────────────────┐</w:t>
+        <w:t xml:space="preserve">    Minio["MinIO\nS3-compatible\nFile storage"]</w:t>
       </w:r>
       <w:r>
         <w:br/>
@@ -1670,25 +2557,19 @@
         <w:rPr>
           <w:rStyle w:val="VerbatimChar"/>
         </w:rPr>
-        <w:t xml:space="preserve">                          │            nginx                  │</w:t>
+        <w:t xml:space="preserve">    OpenAI["OpenAI API\nResponses API · Files API\nVector Stores"]</w:t>
       </w:r>
       <w:r>
         <w:br/>
       </w:r>
       <w:r>
-        <w:rPr>
-          <w:rStyle w:val="VerbatimChar"/>
-        </w:rPr>
-        <w:t xml:space="preserve">                          │  SSL termination (Let's Encrypt)  │</w:t>
-      </w:r>
-      <w:r>
         <w:br/>
       </w:r>
       <w:r>
         <w:rPr>
           <w:rStyle w:val="VerbatimChar"/>
         </w:rPr>
-        <w:t xml:space="preserve">                          │  cranberry.satu-meja.com → :3000  │</w:t>
+        <w:t xml:space="preserve">    Browser --&gt;|HTTPS| nginx</w:t>
       </w:r>
       <w:r>
         <w:br/>
@@ -1697,7 +2578,7 @@
         <w:rPr>
           <w:rStyle w:val="VerbatimChar"/>
         </w:rPr>
-        <w:t xml:space="preserve">                          └──────────────┬───────────────────┘</w:t>
+        <w:t xml:space="preserve">    nginx --&gt;|HTTP :3000 internal| App</w:t>
       </w:r>
       <w:r>
         <w:br/>
@@ -1706,7 +2587,7 @@
         <w:rPr>
           <w:rStyle w:val="VerbatimChar"/>
         </w:rPr>
-        <w:t xml:space="preserve">                                         │ HTTP :3000</w:t>
+        <w:t xml:space="preserve">    App --&gt; PG</w:t>
       </w:r>
       <w:r>
         <w:br/>
@@ -1715,7 +2596,7 @@
         <w:rPr>
           <w:rStyle w:val="VerbatimChar"/>
         </w:rPr>
-        <w:t xml:space="preserve">                          ┌──────────────▼───────────────────┐</w:t>
+        <w:t xml:space="preserve">    App --&gt; Minio</w:t>
       </w:r>
       <w:r>
         <w:br/>
@@ -1724,106 +2605,7 @@
         <w:rPr>
           <w:rStyle w:val="VerbatimChar"/>
         </w:rPr>
-        <w:t xml:space="preserve">                          │       Next.js App (Docker)        │</w:t>
-      </w:r>
-      <w:r>
-        <w:br/>
-      </w:r>
-      <w:r>
-        <w:rPr>
-          <w:rStyle w:val="VerbatimChar"/>
-        </w:rPr>
-        <w:t xml:space="preserve">                          │  - Server Components (SSR)        │</w:t>
-      </w:r>
-      <w:r>
-        <w:br/>
-      </w:r>
-      <w:r>
-        <w:rPr>
-          <w:rStyle w:val="VerbatimChar"/>
-        </w:rPr>
-        <w:t xml:space="preserve">                          │  - API Routes (/api/*)            │</w:t>
-      </w:r>
-      <w:r>
-        <w:br/>
-      </w:r>
-      <w:r>
-        <w:rPr>
-          <w:rStyle w:val="VerbatimChar"/>
-        </w:rPr>
-        <w:t xml:space="preserve">                          │  - SSE Streaming (/api/chat)      │</w:t>
-      </w:r>
-      <w:r>
-        <w:br/>
-      </w:r>
-      <w:r>
-        <w:rPr>
-          <w:rStyle w:val="VerbatimChar"/>
-        </w:rPr>
-        <w:t xml:space="preserve">                          └───┬──────────┬────────────────────┘</w:t>
-      </w:r>
-      <w:r>
-        <w:br/>
-      </w:r>
-      <w:r>
-        <w:rPr>
-          <w:rStyle w:val="VerbatimChar"/>
-        </w:rPr>
-        <w:t xml:space="preserve">                              │          │          │</w:t>
-      </w:r>
-      <w:r>
-        <w:br/>
-      </w:r>
-      <w:r>
-        <w:rPr>
-          <w:rStyle w:val="VerbatimChar"/>
-        </w:rPr>
-        <w:t xml:space="preserve">               ┌──────────────▼─┐  ┌────▼──────┐  ┌▼───────────────┐</w:t>
-      </w:r>
-      <w:r>
-        <w:br/>
-      </w:r>
-      <w:r>
-        <w:rPr>
-          <w:rStyle w:val="VerbatimChar"/>
-        </w:rPr>
-        <w:t xml:space="preserve">               │  PostgreSQL 16  │  │   MinIO   │  │  OpenAI API    │</w:t>
-      </w:r>
-      <w:r>
-        <w:br/>
-      </w:r>
-      <w:r>
-        <w:rPr>
-          <w:rStyle w:val="VerbatimChar"/>
-        </w:rPr>
-        <w:t xml:space="preserve">               │  (Prisma ORM)   │  │ (S3 compat│  │  Responses API │</w:t>
-      </w:r>
-      <w:r>
-        <w:br/>
-      </w:r>
-      <w:r>
-        <w:rPr>
-          <w:rStyle w:val="VerbatimChar"/>
-        </w:rPr>
-        <w:t xml:space="preserve">               │  Users, Agents  │  │  files)   │  │  Files API     │</w:t>
-      </w:r>
-      <w:r>
-        <w:br/>
-      </w:r>
-      <w:r>
-        <w:rPr>
-          <w:rStyle w:val="VerbatimChar"/>
-        </w:rPr>
-        <w:t xml:space="preserve">               │  Conversations  │  └───────────┘  │  Vector Stores │</w:t>
-      </w:r>
-      <w:r>
-        <w:br/>
-      </w:r>
-      <w:r>
-        <w:rPr>
-          <w:rStyle w:val="VerbatimChar"/>
-        </w:rPr>
-        <w:t xml:space="preserve">               └────────────────┘                  └────────────────┘</w:t>
+        <w:t xml:space="preserve">    App --&gt; OpenAI</w:t>
       </w:r>
     </w:p>
     <w:p>
@@ -1899,8 +2681,8 @@
         </w:pict>
       </w:r>
     </w:p>
-    <w:bookmarkEnd w:id="17"/>
-    <w:bookmarkStart w:id="24" w:name="authentication-security"/>
+    <w:bookmarkEnd w:id="18"/>
+    <w:bookmarkStart w:id="25" w:name="authentication-security"/>
     <w:p>
       <w:pPr>
         <w:pStyle w:val="Heading2"/>
@@ -1909,7 +2691,7 @@
         <w:t xml:space="preserve">4. Authentication &amp; Security</w:t>
       </w:r>
     </w:p>
-    <w:bookmarkStart w:id="18" w:name="framework"/>
+    <w:bookmarkStart w:id="19" w:name="framework"/>
     <w:p>
       <w:pPr>
         <w:pStyle w:val="Heading3"/>
@@ -1938,8 +2720,8 @@
         <w:t xml:space="preserve">.</w:t>
       </w:r>
     </w:p>
-    <w:bookmarkEnd w:id="18"/>
-    <w:bookmarkStart w:id="19" w:name="auth-flow"/>
+    <w:bookmarkEnd w:id="19"/>
+    <w:bookmarkStart w:id="20" w:name="auth-flow"/>
     <w:p>
       <w:pPr>
         <w:pStyle w:val="Heading3"/>
@@ -2052,8 +2834,8 @@
         <w:t xml:space="preserve">  3. Session created, HTTP-only cookie returned</w:t>
       </w:r>
     </w:p>
-    <w:bookmarkEnd w:id="19"/>
-    <w:bookmarkStart w:id="20" w:name="session-management"/>
+    <w:bookmarkEnd w:id="20"/>
+    <w:bookmarkStart w:id="21" w:name="session-management"/>
     <w:p>
       <w:pPr>
         <w:pStyle w:val="Heading3"/>
@@ -2222,8 +3004,8 @@
         <w:t xml:space="preserve">redirect("/login")</w:t>
       </w:r>
     </w:p>
-    <w:bookmarkEnd w:id="20"/>
-    <w:bookmarkStart w:id="21" w:name="bot-protection-1"/>
+    <w:bookmarkEnd w:id="21"/>
+    <w:bookmarkStart w:id="22" w:name="bot-protection-1"/>
     <w:p>
       <w:pPr>
         <w:pStyle w:val="Heading3"/>
@@ -2362,8 +3144,8 @@
         <w:t xml:space="preserve">(runtime env)</w:t>
       </w:r>
     </w:p>
-    <w:bookmarkEnd w:id="21"/>
-    <w:bookmarkStart w:id="22" w:name="auth-api"/>
+    <w:bookmarkEnd w:id="22"/>
+    <w:bookmarkStart w:id="23" w:name="auth-api"/>
     <w:p>
       <w:pPr>
         <w:pStyle w:val="Heading3"/>
@@ -2404,8 +3186,8 @@
         <w:t xml:space="preserve">exposes all Better Auth endpoints (signIn, signUp, signOut, verifyOTP, etc.)</w:t>
       </w:r>
     </w:p>
-    <w:bookmarkEnd w:id="22"/>
-    <w:bookmarkStart w:id="23" w:name="rate-limiting"/>
+    <w:bookmarkEnd w:id="23"/>
+    <w:bookmarkStart w:id="24" w:name="rate-limiting"/>
     <w:p>
       <w:pPr>
         <w:pStyle w:val="Heading3"/>
@@ -2492,9 +3274,9 @@
         </w:pict>
       </w:r>
     </w:p>
-    <w:bookmarkEnd w:id="23"/>
     <w:bookmarkEnd w:id="24"/>
-    <w:bookmarkStart w:id="35" w:name="database-design"/>
+    <w:bookmarkEnd w:id="25"/>
+    <w:bookmarkStart w:id="36" w:name="database-design"/>
     <w:p>
       <w:pPr>
         <w:pStyle w:val="Heading2"/>
@@ -2551,7 +3333,7 @@
         <w:t xml:space="preserve">prisma/schema.prisma</w:t>
       </w:r>
     </w:p>
-    <w:bookmarkStart w:id="25" w:name="entity-relationship-overview"/>
+    <w:bookmarkStart w:id="26" w:name="entity-relationship-overview"/>
     <w:p>
       <w:pPr>
         <w:pStyle w:val="Heading3"/>
@@ -2607,8 +3389,8 @@
         <w:t xml:space="preserve">                └──&lt; SavedPrompt</w:t>
       </w:r>
     </w:p>
-    <w:bookmarkEnd w:id="25"/>
-    <w:bookmarkStart w:id="33" w:name="models"/>
+    <w:bookmarkEnd w:id="26"/>
+    <w:bookmarkStart w:id="34" w:name="models"/>
     <w:p>
       <w:pPr>
         <w:pStyle w:val="Heading3"/>
@@ -2617,7 +3399,7 @@
         <w:t xml:space="preserve">Models</w:t>
       </w:r>
     </w:p>
-    <w:bookmarkStart w:id="26" w:name="user"/>
+    <w:bookmarkStart w:id="27" w:name="user"/>
     <w:p>
       <w:pPr>
         <w:pStyle w:val="Heading4"/>
@@ -2918,8 +3700,8 @@
         </w:tc>
       </w:tr>
     </w:tbl>
-    <w:bookmarkEnd w:id="26"/>
-    <w:bookmarkStart w:id="27" w:name="agent"/>
+    <w:bookmarkEnd w:id="27"/>
+    <w:bookmarkStart w:id="28" w:name="agent"/>
     <w:p>
       <w:pPr>
         <w:pStyle w:val="Heading4"/>
@@ -3379,8 +4161,8 @@
         <w:t xml:space="preserve">[updatedAt]</w:t>
       </w:r>
     </w:p>
-    <w:bookmarkEnd w:id="27"/>
-    <w:bookmarkStart w:id="28" w:name="conversation"/>
+    <w:bookmarkEnd w:id="28"/>
+    <w:bookmarkStart w:id="29" w:name="conversation"/>
     <w:p>
       <w:pPr>
         <w:pStyle w:val="Heading4"/>
@@ -3691,8 +4473,8 @@
         <w:t xml:space="preserve">[updatedAt]</w:t>
       </w:r>
     </w:p>
-    <w:bookmarkEnd w:id="28"/>
-    <w:bookmarkStart w:id="29" w:name="message"/>
+    <w:bookmarkEnd w:id="29"/>
+    <w:bookmarkStart w:id="30" w:name="message"/>
     <w:p>
       <w:pPr>
         <w:pStyle w:val="Heading4"/>
@@ -4027,8 +4809,8 @@
         <w:t xml:space="preserve">[createdAt]</w:t>
       </w:r>
     </w:p>
-    <w:bookmarkEnd w:id="29"/>
-    <w:bookmarkStart w:id="30" w:name="agentfile-knowledge-base"/>
+    <w:bookmarkEnd w:id="30"/>
+    <w:bookmarkStart w:id="31" w:name="agentfile-knowledge-base"/>
     <w:p>
       <w:pPr>
         <w:pStyle w:val="Heading4"/>
@@ -4502,8 +5284,8 @@
         </w:tc>
       </w:tr>
     </w:tbl>
-    <w:bookmarkEnd w:id="30"/>
-    <w:bookmarkStart w:id="31" w:name="chatattachment-per-message"/>
+    <w:bookmarkEnd w:id="31"/>
+    <w:bookmarkStart w:id="32" w:name="chatattachment-per-message"/>
     <w:p>
       <w:pPr>
         <w:pStyle w:val="Heading4"/>
@@ -4944,8 +5726,8 @@
         </w:tc>
       </w:tr>
     </w:tbl>
-    <w:bookmarkEnd w:id="31"/>
-    <w:bookmarkStart w:id="32" w:name="savedprompt"/>
+    <w:bookmarkEnd w:id="32"/>
+    <w:bookmarkStart w:id="33" w:name="savedprompt"/>
     <w:p>
       <w:pPr>
         <w:pStyle w:val="Heading4"/>
@@ -5211,9 +5993,9 @@
         </w:tc>
       </w:tr>
     </w:tbl>
-    <w:bookmarkEnd w:id="32"/>
     <w:bookmarkEnd w:id="33"/>
-    <w:bookmarkStart w:id="34" w:name="migrations"/>
+    <w:bookmarkEnd w:id="34"/>
+    <w:bookmarkStart w:id="35" w:name="migrations"/>
     <w:p>
       <w:pPr>
         <w:pStyle w:val="Heading3"/>
@@ -5403,9 +6185,9 @@
         </w:pict>
       </w:r>
     </w:p>
-    <w:bookmarkEnd w:id="34"/>
     <w:bookmarkEnd w:id="35"/>
-    <w:bookmarkStart w:id="42" w:name="api-reference"/>
+    <w:bookmarkEnd w:id="36"/>
+    <w:bookmarkStart w:id="43" w:name="api-reference"/>
     <w:p>
       <w:pPr>
         <w:pStyle w:val="Heading2"/>
@@ -5434,7 +6216,7 @@
         <w:t xml:space="preserve">.</w:t>
       </w:r>
     </w:p>
-    <w:bookmarkStart w:id="36" w:name="authentication"/>
+    <w:bookmarkStart w:id="37" w:name="authentication"/>
     <w:p>
       <w:pPr>
         <w:pStyle w:val="Heading3"/>
@@ -5554,8 +6336,8 @@
         </w:tc>
       </w:tr>
     </w:tbl>
-    <w:bookmarkEnd w:id="36"/>
-    <w:bookmarkStart w:id="37" w:name="chat"/>
+    <w:bookmarkEnd w:id="37"/>
+    <w:bookmarkStart w:id="38" w:name="chat"/>
     <w:p>
       <w:pPr>
         <w:pStyle w:val="Heading3"/>
@@ -6023,8 +6805,8 @@
         </w:tc>
       </w:tr>
     </w:tbl>
-    <w:bookmarkEnd w:id="37"/>
-    <w:bookmarkStart w:id="38" w:name="agents"/>
+    <w:bookmarkEnd w:id="38"/>
+    <w:bookmarkStart w:id="39" w:name="agents"/>
     <w:p>
       <w:pPr>
         <w:pStyle w:val="Heading3"/>
@@ -6687,8 +7469,8 @@
         </w:tc>
       </w:tr>
     </w:tbl>
-    <w:bookmarkEnd w:id="38"/>
-    <w:bookmarkStart w:id="39" w:name="conversations"/>
+    <w:bookmarkEnd w:id="39"/>
+    <w:bookmarkStart w:id="40" w:name="conversations"/>
     <w:p>
       <w:pPr>
         <w:pStyle w:val="Heading3"/>
@@ -6958,8 +7740,8 @@
         </w:tc>
       </w:tr>
     </w:tbl>
-    <w:bookmarkEnd w:id="39"/>
-    <w:bookmarkStart w:id="40" w:name="files"/>
+    <w:bookmarkEnd w:id="40"/>
+    <w:bookmarkStart w:id="41" w:name="files"/>
     <w:p>
       <w:pPr>
         <w:pStyle w:val="Heading3"/>
@@ -7103,8 +7885,8 @@
         </w:tc>
       </w:tr>
     </w:tbl>
-    <w:bookmarkEnd w:id="40"/>
-    <w:bookmarkStart w:id="41" w:name="saved-prompts"/>
+    <w:bookmarkEnd w:id="41"/>
+    <w:bookmarkStart w:id="42" w:name="saved-prompts"/>
     <w:p>
       <w:pPr>
         <w:pStyle w:val="Heading3"/>
@@ -7387,9 +8169,9 @@
         </w:pict>
       </w:r>
     </w:p>
-    <w:bookmarkEnd w:id="41"/>
     <w:bookmarkEnd w:id="42"/>
-    <w:bookmarkStart w:id="50" w:name="ai-chat-engine"/>
+    <w:bookmarkEnd w:id="43"/>
+    <w:bookmarkStart w:id="51" w:name="ai-chat-engine"/>
     <w:p>
       <w:pPr>
         <w:pStyle w:val="Heading2"/>
@@ -7398,7 +8180,7 @@
         <w:t xml:space="preserve">7. AI &amp; Chat Engine</w:t>
       </w:r>
     </w:p>
-    <w:bookmarkStart w:id="43" w:name="openai-integration"/>
+    <w:bookmarkStart w:id="44" w:name="openai-integration"/>
     <w:p>
       <w:pPr>
         <w:pStyle w:val="Heading3"/>
@@ -7500,8 +8282,8 @@
         <w:t xml:space="preserve">for conversation continuity.</w:t>
       </w:r>
     </w:p>
-    <w:bookmarkEnd w:id="43"/>
-    <w:bookmarkStart w:id="44" w:name="available-models"/>
+    <w:bookmarkEnd w:id="44"/>
+    <w:bookmarkStart w:id="45" w:name="available-models"/>
     <w:p>
       <w:pPr>
         <w:pStyle w:val="Heading3"/>
@@ -7750,8 +8532,8 @@
         </w:tc>
       </w:tr>
     </w:tbl>
-    <w:bookmarkEnd w:id="44"/>
-    <w:bookmarkStart w:id="45" w:name="chat-request-flow"/>
+    <w:bookmarkEnd w:id="45"/>
+    <w:bookmarkStart w:id="46" w:name="chat-request-flow"/>
     <w:p>
       <w:pPr>
         <w:pStyle w:val="Heading3"/>
@@ -7924,8 +8706,8 @@
         <w:t xml:space="preserve">     - "error" → emit error event</w:t>
       </w:r>
     </w:p>
-    <w:bookmarkEnd w:id="45"/>
-    <w:bookmarkStart w:id="46" w:name="conversation-continuity"/>
+    <w:bookmarkEnd w:id="46"/>
+    <w:bookmarkStart w:id="47" w:name="conversation-continuity"/>
     <w:p>
       <w:pPr>
         <w:pStyle w:val="Heading3"/>
@@ -7969,8 +8751,8 @@
         <w:t xml:space="preserve">to the Responses API, allowing OpenAI to recall the prior context without re-sending the full history.</w:t>
       </w:r>
     </w:p>
-    <w:bookmarkEnd w:id="46"/>
-    <w:bookmarkStart w:id="47" w:name="multimodal-input"/>
+    <w:bookmarkEnd w:id="47"/>
+    <w:bookmarkStart w:id="48" w:name="multimodal-input"/>
     <w:p>
       <w:pPr>
         <w:pStyle w:val="Heading3"/>
@@ -8217,8 +8999,8 @@
         <w:t xml:space="preserve">]</w:t>
       </w:r>
     </w:p>
-    <w:bookmarkEnd w:id="47"/>
-    <w:bookmarkStart w:id="48" w:name="tools"/>
+    <w:bookmarkEnd w:id="48"/>
+    <w:bookmarkStart w:id="49" w:name="tools"/>
     <w:p>
       <w:pPr>
         <w:pStyle w:val="Heading3"/>
@@ -8380,8 +9162,8 @@
         <w:t xml:space="preserve">Both tools can be active simultaneously.</w:t>
       </w:r>
     </w:p>
-    <w:bookmarkEnd w:id="48"/>
-    <w:bookmarkStart w:id="49" w:name="streaming-sse"/>
+    <w:bookmarkEnd w:id="49"/>
+    <w:bookmarkStart w:id="50" w:name="streaming-sse"/>
     <w:p>
       <w:pPr>
         <w:pStyle w:val="Heading3"/>
@@ -8481,9 +9263,9 @@
         </w:pict>
       </w:r>
     </w:p>
-    <w:bookmarkEnd w:id="49"/>
     <w:bookmarkEnd w:id="50"/>
-    <w:bookmarkStart w:id="55" w:name="agent-system"/>
+    <w:bookmarkEnd w:id="51"/>
+    <w:bookmarkStart w:id="56" w:name="agent-system"/>
     <w:p>
       <w:pPr>
         <w:pStyle w:val="Heading2"/>
@@ -8492,7 +9274,7 @@
         <w:t xml:space="preserve">8. Agent System</w:t>
       </w:r>
     </w:p>
-    <w:bookmarkStart w:id="51" w:name="what-is-an-agent"/>
+    <w:bookmarkStart w:id="52" w:name="what-is-an-agent"/>
     <w:p>
       <w:pPr>
         <w:pStyle w:val="Heading3"/>
@@ -8619,8 +9401,8 @@
         <w:t xml:space="preserve">(reusable messages)</w:t>
       </w:r>
     </w:p>
-    <w:bookmarkEnd w:id="51"/>
-    <w:bookmarkStart w:id="52" w:name="default-agent"/>
+    <w:bookmarkEnd w:id="52"/>
+    <w:bookmarkStart w:id="53" w:name="default-agent"/>
     <w:p>
       <w:pPr>
         <w:pStyle w:val="Heading3"/>
@@ -8700,8 +9482,8 @@
         <w:t xml:space="preserve">route</w:t>
       </w:r>
     </w:p>
-    <w:bookmarkEnd w:id="52"/>
-    <w:bookmarkStart w:id="53" w:name="agent-lifecycle"/>
+    <w:bookmarkEnd w:id="53"/>
+    <w:bookmarkStart w:id="54" w:name="agent-lifecycle"/>
     <w:p>
       <w:pPr>
         <w:pStyle w:val="Heading3"/>
@@ -8906,8 +9688,8 @@
         <w:t xml:space="preserve">This is called during file uploads to guarantee a vector store exists before attaching files.</w:t>
       </w:r>
     </w:p>
-    <w:bookmarkEnd w:id="53"/>
-    <w:bookmarkStart w:id="54" w:name="query-layer"/>
+    <w:bookmarkEnd w:id="54"/>
+    <w:bookmarkStart w:id="55" w:name="query-layer"/>
     <w:p>
       <w:pPr>
         <w:pStyle w:val="Heading3"/>
@@ -9279,9 +10061,9 @@
         </w:pict>
       </w:r>
     </w:p>
-    <w:bookmarkEnd w:id="54"/>
     <w:bookmarkEnd w:id="55"/>
-    <w:bookmarkStart w:id="64" w:name="file-storage-uploads"/>
+    <w:bookmarkEnd w:id="56"/>
+    <w:bookmarkStart w:id="65" w:name="file-storage-uploads"/>
     <w:p>
       <w:pPr>
         <w:pStyle w:val="Heading2"/>
@@ -9290,7 +10072,7 @@
         <w:t xml:space="preserve">9. File Storage &amp; Uploads</w:t>
       </w:r>
     </w:p>
-    <w:bookmarkStart w:id="56" w:name="architecture"/>
+    <w:bookmarkStart w:id="57" w:name="architecture"/>
     <w:p>
       <w:pPr>
         <w:pStyle w:val="Heading3"/>
@@ -9351,8 +10133,8 @@
         <w:t xml:space="preserve">— for inference (multimodal input or vector store indexing)</w:t>
       </w:r>
     </w:p>
-    <w:bookmarkEnd w:id="56"/>
-    <w:bookmarkStart w:id="57" w:name="minio-configuration"/>
+    <w:bookmarkEnd w:id="57"/>
+    <w:bookmarkStart w:id="58" w:name="minio-configuration"/>
     <w:p>
       <w:pPr>
         <w:pStyle w:val="Heading3"/>
@@ -9594,8 +10376,8 @@
         </w:tc>
       </w:tr>
     </w:tbl>
-    <w:bookmarkEnd w:id="57"/>
-    <w:bookmarkStart w:id="60" w:name="file-types"/>
+    <w:bookmarkEnd w:id="58"/>
+    <w:bookmarkStart w:id="61" w:name="file-types"/>
     <w:p>
       <w:pPr>
         <w:pStyle w:val="Heading3"/>
@@ -9604,7 +10386,7 @@
         <w:t xml:space="preserve">File Types</w:t>
       </w:r>
     </w:p>
-    <w:bookmarkStart w:id="58" w:name="chat-attachments-per-message"/>
+    <w:bookmarkStart w:id="59" w:name="chat-attachments-per-message"/>
     <w:p>
       <w:pPr>
         <w:pStyle w:val="Heading4"/>
@@ -9759,8 +10541,8 @@
         <w:t xml:space="preserve">tied to the conversation/message</w:t>
       </w:r>
     </w:p>
-    <w:bookmarkEnd w:id="58"/>
-    <w:bookmarkStart w:id="59" w:name="agent-files-knowledge-base"/>
+    <w:bookmarkEnd w:id="59"/>
+    <w:bookmarkStart w:id="60" w:name="agent-files-knowledge-base"/>
     <w:p>
       <w:pPr>
         <w:pStyle w:val="Heading4"/>
@@ -9897,9 +10679,9 @@
         <w:t xml:space="preserve">persists until agent or file deleted</w:t>
       </w:r>
     </w:p>
-    <w:bookmarkEnd w:id="59"/>
     <w:bookmarkEnd w:id="60"/>
-    <w:bookmarkStart w:id="61" w:name="file-validation"/>
+    <w:bookmarkEnd w:id="61"/>
+    <w:bookmarkStart w:id="62" w:name="file-validation"/>
     <w:p>
       <w:pPr>
         <w:pStyle w:val="Heading3"/>
@@ -10056,8 +10838,8 @@
         </w:tc>
       </w:tr>
     </w:tbl>
-    <w:bookmarkEnd w:id="61"/>
-    <w:bookmarkStart w:id="62" w:name="agent-file-upload-flow"/>
+    <w:bookmarkEnd w:id="62"/>
+    <w:bookmarkStart w:id="63" w:name="agent-file-upload-flow"/>
     <w:p>
       <w:pPr>
         <w:pStyle w:val="Heading3"/>
@@ -10176,8 +10958,8 @@
         <w:t xml:space="preserve">  8. Return AgentFile</w:t>
       </w:r>
     </w:p>
-    <w:bookmarkEnd w:id="62"/>
-    <w:bookmarkStart w:id="63" w:name="chat-attachment-upload-flow"/>
+    <w:bookmarkEnd w:id="63"/>
+    <w:bookmarkStart w:id="64" w:name="chat-attachment-upload-flow"/>
     <w:p>
       <w:pPr>
         <w:pStyle w:val="Heading3"/>
@@ -10249,9 +11031,9 @@
         </w:pict>
       </w:r>
     </w:p>
-    <w:bookmarkEnd w:id="63"/>
     <w:bookmarkEnd w:id="64"/>
-    <w:bookmarkStart w:id="76" w:name="frontend-architecture"/>
+    <w:bookmarkEnd w:id="65"/>
+    <w:bookmarkStart w:id="77" w:name="frontend-architecture"/>
     <w:p>
       <w:pPr>
         <w:pStyle w:val="Heading2"/>
@@ -10260,7 +11042,7 @@
         <w:t xml:space="preserve">10. Frontend Architecture</w:t>
       </w:r>
     </w:p>
-    <w:bookmarkStart w:id="65" w:name="page-structure"/>
+    <w:bookmarkStart w:id="66" w:name="page-structure"/>
     <w:p>
       <w:pPr>
         <w:pStyle w:val="Heading3"/>
@@ -10424,8 +11206,8 @@
         <w:t xml:space="preserve">└── api/                           Route handlers (see §6)</w:t>
       </w:r>
     </w:p>
-    <w:bookmarkEnd w:id="65"/>
-    <w:bookmarkStart w:id="71" w:name="key-components"/>
+    <w:bookmarkEnd w:id="66"/>
+    <w:bookmarkStart w:id="72" w:name="key-components"/>
     <w:p>
       <w:pPr>
         <w:pStyle w:val="Heading3"/>
@@ -10434,7 +11216,7 @@
         <w:t xml:space="preserve">Key Components</w:t>
       </w:r>
     </w:p>
-    <w:bookmarkStart w:id="66" w:name="chatroom-componentschatchat-room.tsx"/>
+    <w:bookmarkStart w:id="67" w:name="chatroom-componentschatchat-room.tsx"/>
     <w:p>
       <w:pPr>
         <w:pStyle w:val="Heading4"/>
@@ -10769,8 +11551,8 @@
         <w:t xml:space="preserve">→ remove from pending list</w:t>
       </w:r>
     </w:p>
-    <w:bookmarkEnd w:id="66"/>
-    <w:bookmarkStart w:id="67" w:name="chatinput-componentschatchat-input.tsx"/>
+    <w:bookmarkEnd w:id="67"/>
+    <w:bookmarkStart w:id="68" w:name="chatinput-componentschatchat-input.tsx"/>
     <w:p>
       <w:pPr>
         <w:pStyle w:val="Heading4"/>
@@ -10978,8 +11760,8 @@
         <w:t xml:space="preserve">- Inline mode badges shown when active</w:t>
       </w:r>
     </w:p>
-    <w:bookmarkEnd w:id="67"/>
-    <w:bookmarkStart w:id="68" w:name="Xfb59c22977e6e9c7aae6441596541697d6fb19d"/>
+    <w:bookmarkEnd w:id="68"/>
+    <w:bookmarkStart w:id="69" w:name="Xfb59c22977e6e9c7aae6441596541697d6fb19d"/>
     <w:p>
       <w:pPr>
         <w:pStyle w:val="Heading4"/>
@@ -11080,8 +11862,8 @@
         <w:t xml:space="preserve">timestamp</w:t>
       </w:r>
     </w:p>
-    <w:bookmarkEnd w:id="68"/>
-    <w:bookmarkStart w:id="69" w:name="agentform-componentsagentsagent-form.tsx"/>
+    <w:bookmarkEnd w:id="69"/>
+    <w:bookmarkStart w:id="70" w:name="agentform-componentsagentsagent-form.tsx"/>
     <w:p>
       <w:pPr>
         <w:pStyle w:val="Heading4"/>
@@ -11157,8 +11939,8 @@
         <w:t xml:space="preserve">Save, Delete (with confirm dialog)</w:t>
       </w:r>
     </w:p>
-    <w:bookmarkEnd w:id="69"/>
-    <w:bookmarkStart w:id="70" w:name="X2ab6224632dc292d2c2ea0cf3ce90ed464896a1"/>
+    <w:bookmarkEnd w:id="70"/>
+    <w:bookmarkStart w:id="71" w:name="X2ab6224632dc292d2c2ea0cf3ce90ed464896a1"/>
     <w:p>
       <w:pPr>
         <w:pStyle w:val="Heading4"/>
@@ -11220,9 +12002,9 @@
         <w:t xml:space="preserve">- Supported: PDF, JPEG, PNG, WebP (max 10 MB)</w:t>
       </w:r>
     </w:p>
-    <w:bookmarkEnd w:id="70"/>
     <w:bookmarkEnd w:id="71"/>
-    <w:bookmarkStart w:id="72" w:name="state-management"/>
+    <w:bookmarkEnd w:id="72"/>
+    <w:bookmarkStart w:id="73" w:name="state-management"/>
     <w:p>
       <w:pPr>
         <w:pStyle w:val="Heading3"/>
@@ -11357,8 +12139,8 @@
         <w:t xml:space="preserve">+ Valibot/Zod schemas</w:t>
       </w:r>
     </w:p>
-    <w:bookmarkEnd w:id="72"/>
-    <w:bookmarkStart w:id="73" w:name="theme"/>
+    <w:bookmarkEnd w:id="73"/>
+    <w:bookmarkStart w:id="74" w:name="theme"/>
     <w:p>
       <w:pPr>
         <w:pStyle w:val="Heading3"/>
@@ -11478,8 +12260,8 @@
         <w:t xml:space="preserve">at far right</w:t>
       </w:r>
     </w:p>
-    <w:bookmarkEnd w:id="73"/>
-    <w:bookmarkStart w:id="74" w:name="fonts"/>
+    <w:bookmarkEnd w:id="74"/>
+    <w:bookmarkStart w:id="75" w:name="fonts"/>
     <w:p>
       <w:pPr>
         <w:pStyle w:val="Heading3"/>
@@ -11598,8 +12380,8 @@
         </w:tc>
       </w:tr>
     </w:tbl>
-    <w:bookmarkEnd w:id="74"/>
-    <w:bookmarkStart w:id="75" w:name="loading-error-states"/>
+    <w:bookmarkEnd w:id="75"/>
+    <w:bookmarkStart w:id="76" w:name="loading-error-states"/>
     <w:p>
       <w:pPr>
         <w:pStyle w:val="Heading3"/>
@@ -11677,9 +12459,9 @@
         </w:pict>
       </w:r>
     </w:p>
-    <w:bookmarkEnd w:id="75"/>
     <w:bookmarkEnd w:id="76"/>
-    <w:bookmarkStart w:id="80" w:name="saved-prompts-1"/>
+    <w:bookmarkEnd w:id="77"/>
+    <w:bookmarkStart w:id="81" w:name="saved-prompts-1"/>
     <w:p>
       <w:pPr>
         <w:pStyle w:val="Heading2"/>
@@ -11688,7 +12470,7 @@
         <w:t xml:space="preserve">11. Saved Prompts</w:t>
       </w:r>
     </w:p>
-    <w:bookmarkStart w:id="77" w:name="purpose"/>
+    <w:bookmarkStart w:id="78" w:name="purpose"/>
     <w:p>
       <w:pPr>
         <w:pStyle w:val="Heading3"/>
@@ -11705,8 +12487,8 @@
         <w:t xml:space="preserve">Allows users to save frequently used messages per agent, for quick reuse in chat.</w:t>
       </w:r>
     </w:p>
-    <w:bookmarkEnd w:id="77"/>
-    <w:bookmarkStart w:id="78" w:name="data-flow"/>
+    <w:bookmarkEnd w:id="78"/>
+    <w:bookmarkStart w:id="79" w:name="data-flow"/>
     <w:p>
       <w:pPr>
         <w:pStyle w:val="Heading3"/>
@@ -11892,8 +12674,8 @@
         <w:t xml:space="preserve">3. Removed from list, toast success</w:t>
       </w:r>
     </w:p>
-    <w:bookmarkEnd w:id="78"/>
-    <w:bookmarkStart w:id="79" w:name="query-functions-libchatsaved-prompts.ts"/>
+    <w:bookmarkEnd w:id="79"/>
+    <w:bookmarkStart w:id="80" w:name="query-functions-libchatsaved-prompts.ts"/>
     <w:p>
       <w:pPr>
         <w:pStyle w:val="Heading3"/>
@@ -12038,9 +12820,9 @@
         </w:pict>
       </w:r>
     </w:p>
-    <w:bookmarkEnd w:id="79"/>
     <w:bookmarkEnd w:id="80"/>
-    <w:bookmarkStart w:id="87" w:name="deployment-infrastructure"/>
+    <w:bookmarkEnd w:id="81"/>
+    <w:bookmarkStart w:id="88" w:name="deployment-infrastructure"/>
     <w:p>
       <w:pPr>
         <w:pStyle w:val="Heading2"/>
@@ -12049,7 +12831,7 @@
         <w:t xml:space="preserve">12. Deployment &amp; Infrastructure</w:t>
       </w:r>
     </w:p>
-    <w:bookmarkStart w:id="81" w:name="server"/>
+    <w:bookmarkStart w:id="82" w:name="server"/>
     <w:p>
       <w:pPr>
         <w:pStyle w:val="Heading3"/>
@@ -12264,8 +13046,8 @@
         </w:tc>
       </w:tr>
     </w:tbl>
-    <w:bookmarkEnd w:id="81"/>
-    <w:bookmarkStart w:id="82" w:name="docker-architecture"/>
+    <w:bookmarkEnd w:id="82"/>
+    <w:bookmarkStart w:id="83" w:name="docker-architecture"/>
     <w:p>
       <w:pPr>
         <w:pStyle w:val="Heading3"/>
@@ -12725,8 +13507,8 @@
         <w:t xml:space="preserve">node server.js</w:t>
       </w:r>
     </w:p>
-    <w:bookmarkEnd w:id="82"/>
-    <w:bookmarkStart w:id="83" w:name="docker-compose-services"/>
+    <w:bookmarkEnd w:id="83"/>
+    <w:bookmarkStart w:id="84" w:name="docker-compose-services"/>
     <w:p>
       <w:pPr>
         <w:pStyle w:val="Heading3"/>
@@ -12958,8 +13740,8 @@
         <w:t xml:space="preserve">bridge network. Postgres and MinIO use named volumes for persistence. App waits for both to be healthy before starting.</w:t>
       </w:r>
     </w:p>
-    <w:bookmarkEnd w:id="83"/>
-    <w:bookmarkStart w:id="84" w:name="nginx-configuration"/>
+    <w:bookmarkEnd w:id="84"/>
+    <w:bookmarkStart w:id="85" w:name="nginx-configuration"/>
     <w:p>
       <w:pPr>
         <w:pStyle w:val="Heading3"/>
@@ -13096,8 +13878,8 @@
         <w:t xml:space="preserve">for long AI responses</w:t>
       </w:r>
     </w:p>
-    <w:bookmarkEnd w:id="84"/>
-    <w:bookmarkStart w:id="85" w:name="deploy-script-deploy.sh"/>
+    <w:bookmarkEnd w:id="85"/>
+    <w:bookmarkStart w:id="86" w:name="deploy-script-deploy.sh"/>
     <w:p>
       <w:pPr>
         <w:pStyle w:val="Heading3"/>
@@ -13198,8 +13980,8 @@
         <w:t xml:space="preserve">   (rolling restart, postgres + minio already running)</w:t>
       </w:r>
     </w:p>
-    <w:bookmarkEnd w:id="85"/>
-    <w:bookmarkStart w:id="86" w:name="environment-variables"/>
+    <w:bookmarkEnd w:id="86"/>
+    <w:bookmarkStart w:id="87" w:name="environment-variables"/>
     <w:p>
       <w:pPr>
         <w:pStyle w:val="Heading3"/>
@@ -13928,9 +14710,9 @@
         </w:pict>
       </w:r>
     </w:p>
-    <w:bookmarkEnd w:id="86"/>
     <w:bookmarkEnd w:id="87"/>
-    <w:bookmarkStart w:id="93" w:name="non-functional-requirements"/>
+    <w:bookmarkEnd w:id="88"/>
+    <w:bookmarkStart w:id="94" w:name="non-functional-requirements"/>
     <w:p>
       <w:pPr>
         <w:pStyle w:val="Heading2"/>
@@ -13939,7 +14721,7 @@
         <w:t xml:space="preserve">13. Non-Functional Requirements</w:t>
       </w:r>
     </w:p>
-    <w:bookmarkStart w:id="88" w:name="scalability"/>
+    <w:bookmarkStart w:id="89" w:name="scalability"/>
     <w:p>
       <w:pPr>
         <w:pStyle w:val="Heading3"/>
@@ -14091,8 +14873,8 @@
         <w:t xml:space="preserve">SSE (efficient long-lived connection)</w:t>
       </w:r>
     </w:p>
-    <w:bookmarkEnd w:id="88"/>
-    <w:bookmarkStart w:id="89" w:name="security"/>
+    <w:bookmarkEnd w:id="89"/>
+    <w:bookmarkStart w:id="90" w:name="security"/>
     <w:p>
       <w:pPr>
         <w:pStyle w:val="Heading3"/>
@@ -14233,8 +15015,8 @@
         <w:t xml:space="preserve">only</w:t>
       </w:r>
     </w:p>
-    <w:bookmarkEnd w:id="89"/>
-    <w:bookmarkStart w:id="90" w:name="reliability"/>
+    <w:bookmarkEnd w:id="90"/>
+    <w:bookmarkStart w:id="91" w:name="reliability"/>
     <w:p>
       <w:pPr>
         <w:pStyle w:val="Heading3"/>
@@ -14333,8 +15115,8 @@
         <w:t xml:space="preserve">SSL auto-renews via certbot cron</w:t>
       </w:r>
     </w:p>
-    <w:bookmarkEnd w:id="90"/>
-    <w:bookmarkStart w:id="91" w:name="extensibility"/>
+    <w:bookmarkEnd w:id="91"/>
+    <w:bookmarkStart w:id="92" w:name="extensibility"/>
     <w:p>
       <w:pPr>
         <w:pStyle w:val="Heading3"/>
@@ -14427,8 +15209,8 @@
         <w:t xml:space="preserve">File types validated in a dedicated function (easy to extend)</w:t>
       </w:r>
     </w:p>
-    <w:bookmarkEnd w:id="91"/>
-    <w:bookmarkStart w:id="92" w:name="performance"/>
+    <w:bookmarkEnd w:id="92"/>
+    <w:bookmarkStart w:id="93" w:name="performance"/>
     <w:p>
       <w:pPr>
         <w:pStyle w:val="Heading3"/>
@@ -14540,9 +15322,9 @@
         <w:t xml:space="preserve">Document generated from codebase analysis of Cranberry Juice v1.0.</w:t>
       </w:r>
     </w:p>
-    <w:bookmarkEnd w:id="92"/>
     <w:bookmarkEnd w:id="93"/>
     <w:bookmarkEnd w:id="94"/>
+    <w:bookmarkEnd w:id="95"/>
     <w:sectPr>
       <w:footnotePr>
         <w:numRestart w:val="eachSect"/>

</xml_diff>